<commit_message>
Add pilot config sweeps (v4-v11), RQ1 multiblock rendering, stitching artefact experiment notebook, and paper draft updates
Config sweeps (v4-v11) tune densification/loss toward minimal-N per-block
fitting; RQ1 scripts add multiblock MIP rendering and plotting. The eda
notebook documents the Section 4.2 cross-block stitching artefact
investigation (naive-sum vs. hard-partition combiners, now including
vol_SSIM/vol_LPIPS alongside vol_PSNR, plus in-progress 4-block/8-block
junction generalisations), with matching figures/tables carried into
Experiments.docx.

Co-Authored-By: Claude Sonnet 5 <noreply@anthropic.com>
</commit_message>
<xml_diff>
--- a/fafb_pilot/draft/Experiments.docx
+++ b/fafb_pilot/draft/Experiments.docx
@@ -513,29 +513,46 @@
           <w:b/>
           <w:sz w:val="20"/>
         </w:rPr>
-        <w:t>Figure 1. Ground-truth vs. reconstructed middle-slice comparison for one representative block, at both training budgets.</w:t>
+        <w:t>Figure 1. Ground-truth vs. reconstructed middle-slice comparison for the four best-performing v2 (config_v2.yml) blocks: b_211, b_203, b_221, and b_231 (vol_PSNR 40.23-40.47 dB). Each panel shows GT / Prediction / |Diff| for the XY, XZ and YZ mid-planes at the final epoch (500).</w:t>
       </w:r>
     </w:p>
-    <w:p/>
     <w:p>
       <w:pPr>
-        <w:spacing w:after="280"/>
-        <w:jc w:val="both"/>
+        <w:jc w:val="center"/>
       </w:pPr>
       <w:r>
-        <w:rPr>
-          <w:b/>
-          <w:i/>
-          <w:color w:val="C00000"/>
-        </w:rPr>
-        <w:t xml:space="preserve">TO FILL IN: </w:t>
-      </w:r>
-      <w:r>
-        <w:rPr>
-          <w:i/>
-          <w:color w:val="C00000"/>
-        </w:rPr>
-        <w:t>use the slices_epNNNN.png visualisation already saved automatically at the final epoch inside each block's output directory (models/blocks/b_000/ for v1, models/blocks_v2/b_000/ for v2, or any other representative block), which already shows GT / Prediction / |Diff| for the XY, XZ and YZ mid-planes — crop or combine the two configurations' images side by side.</w:t>
+        <w:drawing>
+          <wp:inline xmlns:a="http://schemas.openxmlformats.org/drawingml/2006/main" xmlns:pic="http://schemas.openxmlformats.org/drawingml/2006/picture">
+            <wp:extent cx="5943600" cy="6083907"/>
+            <wp:docPr id="1" name="Picture 1"/>
+            <wp:cNvGraphicFramePr>
+              <a:graphicFrameLocks noChangeAspect="1"/>
+            </wp:cNvGraphicFramePr>
+            <a:graphic>
+              <a:graphicData uri="http://schemas.openxmlformats.org/drawingml/2006/picture">
+                <pic:pic>
+                  <pic:nvPicPr>
+                    <pic:cNvPr id="0" name="figure1_best4_v2.png"/>
+                    <pic:cNvPicPr/>
+                  </pic:nvPicPr>
+                  <pic:blipFill>
+                    <a:blip r:embed="rId10"/>
+                    <a:stretch>
+                      <a:fillRect/>
+                    </a:stretch>
+                  </pic:blipFill>
+                  <pic:spPr>
+                    <a:xfrm>
+                      <a:off x="0" y="0"/>
+                      <a:ext cx="5943600" cy="6083907"/>
+                    </a:xfrm>
+                    <a:prstGeom prst="rect"/>
+                  </pic:spPr>
+                </pic:pic>
+              </a:graphicData>
+            </a:graphic>
+          </wp:inline>
+        </w:drawing>
       </w:r>
     </w:p>
     <w:p>
@@ -551,7 +568,9 @@
         <w:jc w:val="both"/>
       </w:pPr>
       <w:r>
-        <w:t>This experiment quantifies the cross-block contamination that arises when independently-trained blocks are combined by the naive additive stitching procedure of Section 3.5, motivating the need for either a higher per-block training budget or a normalised compositing scheme.</w:t>
+        <w:t>This experiment quantifies the cross-block contamination that arises when independently-trained blocks are combined by the naive additive stitching procedure of Section 3.5. Two adjacent, high-fidelity blocks from the v2 training run (b_211 and b_212, each independently reconstructed to approximately 40.4 dB vol_PSNR in isolation; see Table 1 and Figure 1) were used as a controlled test pair. Each block's trained Gaussian mixture was remapped into a shared coordinate frame spanning both blocks, and a 64³ voxel cube straddling the shared boundary — the right half of b_211 and the left half of b_212 — was extracted for direct, ground-truth-referenced evaluation.</w:t>
+        <w:br/>
+        <w:t>As a methodological control, we first verified that reconstructing each block independently and concatenating the resulting voxel grids does not, by itself, reveal any boundary artefact (mean absolute error ≈ 0.006 against ground truth, consistent with ordinary per-block reconstruction noise). This is expected: no interaction between the two blocks' Gaussians occurs in that procedure. The actual stitching pipeline differs in one critical respect — it sums both blocks' raw Gaussian density contributions at every point in the shared frame before evaluation, rather than combining two already-finished reconstructions. Table 2 characterises the effect of this difference directly.</w:t>
       </w:r>
     </w:p>
     <w:p>
@@ -561,16 +580,127 @@
       <w:r>
         <w:rPr>
           <w:b/>
-          <w:sz w:val="20"/>
+          <w:i w:val="0"/>
+          <w:color w:val="000000"/>
         </w:rPr>
-        <w:t>Table 2. Distribution of per-Gaussian scale in the stitched representation, by scale threshold, for the raw (unfiltered) stitched set.</w:t>
+        <w:t>Figure 2. Ground truth vs. two reconstruction procedures at the b_211/b_212 seam (mid-depth slice of the 64³ evaluation cube; dashed line marks the block boundary): independent per-block reconstruction concatenated after clamping (a negative control, left two panels) vs. the real stitching procedure, which sums both blocks' raw Gaussian densities before clamping (right two panels).</w:t>
+      </w:r>
+    </w:p>
+    <w:p>
+      <w:pPr>
+        <w:jc w:val="center"/>
+      </w:pPr>
+      <w:r>
+        <w:drawing>
+          <wp:inline xmlns:a="http://schemas.openxmlformats.org/drawingml/2006/main" xmlns:pic="http://schemas.openxmlformats.org/drawingml/2006/picture">
+            <wp:extent cx="5943600" cy="1541929"/>
+            <wp:docPr id="3" name="Picture 3"/>
+            <wp:cNvGraphicFramePr>
+              <a:graphicFrameLocks noChangeAspect="1"/>
+            </wp:cNvGraphicFramePr>
+            <a:graphic>
+              <a:graphicData uri="http://schemas.openxmlformats.org/drawingml/2006/picture">
+                <pic:pic>
+                  <pic:nvPicPr>
+                    <pic:cNvPr id="0" name="negative_control_vs_real_stitching.png"/>
+                    <pic:cNvPicPr/>
+                  </pic:nvPicPr>
+                  <pic:blipFill>
+                    <a:blip r:embed="rId13"/>
+                    <a:stretch>
+                      <a:fillRect/>
+                    </a:stretch>
+                  </pic:blipFill>
+                  <pic:spPr>
+                    <a:xfrm>
+                      <a:off x="0" y="0"/>
+                      <a:ext cx="5943600" cy="1541929"/>
+                    </a:xfrm>
+                    <a:prstGeom prst="rect"/>
+                  </pic:spPr>
+                </pic:pic>
+              </a:graphicData>
+            </a:graphic>
+          </wp:inline>
+        </w:drawing>
+      </w:r>
+    </w:p>
+    <w:p>
+      <w:r>
+        <w:t>Before quantifying the artefact in Table 2, it is worth showing directly why a naive sanity check can miss it entirely — the two procedures compared here look superficially similar but differ in one critical respect. Panel 1 is ground truth. Panel 2 is the negative control: each block is reconstructed independently from its own Gaussians and clamped to [0,1] individually, and the two finished voxel grids are simply placed side by side. No interaction between the two blocks' Gaussians occurs in this procedure, so the result is, by construction, as clean as each block's own reconstruction — visibly seamless here, with no hint of a boundary. Panel 3 is what the real stitching procedure actually produces: both blocks' raw Gaussians are remapped into one shared coordinate frame and summed at every point before any clamping is applied. The difference is immediately visible — a wide band of saturated (whited-out) voxels spans much of the crop around the boundary, not a thin discontinuity exactly at the seam. Panel 4, the |difference| map against ground truth for this reconstruction, confirms the effect is both substantial and spatially extensive (mean absolute error 0.062, maximum 0.773 in this particular block pair and evaluation pass), concentrated in the same region where panel 3 saturates.</w:t>
+        <w:br/>
+        <w:t>The two procedures differ only in *when* clamping happens relative to combination — after, for the negative control; before, for the real pipeline — yet only one of them reveals the artefact. A validation check built on the negative-control procedure (panel 2) would wrongly conclude that stitching is artefact-free. This is why every quantitative result in this section (Table 2) evaluates the pipeline exactly as it is actually used — raw Gaussians summed before clamping — rather than via any procedure that reconstructs and clamps each block independently first.</w:t>
+      </w:r>
+    </w:p>
+    <w:p>
+      <w:pPr>
+        <w:jc w:val="center"/>
+      </w:pPr>
+      <w:r>
+        <w:rPr>
+          <w:b/>
+          <w:i w:val="0"/>
+          <w:color w:val="000000"/>
+        </w:rPr>
+        <w:t>Figure 2 (continued). Ground truth vs. the hard-partition (sign-gated) reconstruction at the same b_211/b_212 seam and slice as Figure 2, shown on the identical layout and colour scale as the real-stitching panels above, for direct visual comparison.</w:t>
+      </w:r>
+    </w:p>
+    <w:p>
+      <w:pPr>
+        <w:jc w:val="center"/>
+      </w:pPr>
+      <w:r>
+        <w:drawing>
+          <wp:inline xmlns:a="http://schemas.openxmlformats.org/drawingml/2006/main" xmlns:pic="http://schemas.openxmlformats.org/drawingml/2006/picture">
+            <wp:extent cx="5943600" cy="2031727"/>
+            <wp:docPr id="4" name="Picture 4"/>
+            <wp:cNvGraphicFramePr>
+              <a:graphicFrameLocks noChangeAspect="1"/>
+            </wp:cNvGraphicFramePr>
+            <a:graphic>
+              <a:graphicData uri="http://schemas.openxmlformats.org/drawingml/2006/picture">
+                <pic:pic>
+                  <pic:nvPicPr>
+                    <pic:cNvPr id="0" name="seam_hard_partition.png"/>
+                    <pic:cNvPicPr/>
+                  </pic:nvPicPr>
+                  <pic:blipFill>
+                    <a:blip r:embed="rId15"/>
+                    <a:stretch>
+                      <a:fillRect/>
+                    </a:stretch>
+                  </pic:blipFill>
+                  <pic:spPr>
+                    <a:xfrm>
+                      <a:off x="0" y="0"/>
+                      <a:ext cx="5943600" cy="2031727"/>
+                    </a:xfrm>
+                    <a:prstGeom prst="rect"/>
+                  </pic:spPr>
+                </pic:pic>
+              </a:graphicData>
+            </a:graphic>
+          </wp:inline>
+        </w:drawing>
+      </w:r>
+    </w:p>
+    <w:p>
+      <w:r>
+        <w:t>The merit of the fix is immediately visible against the same ground truth and at the same slice as Figure 2: the hard-partition reconstruction is visually indistinguishable from ground truth, with no trace of the saturated band that dominated the real-stitching panel — and its |difference| map, shown on the same colour scale as Figure 2's, is uniformly near-black rather than showing the bright, spatially extensive error that characterised the naive sum. Table 2a places this side by side with Figure 2's numbers directly, on the same mean/maximum absolute-error scale shown in both figures' colour bars.</w:t>
+      </w:r>
+    </w:p>
+    <w:p>
+      <w:r>
+        <w:rPr>
+          <w:b/>
+        </w:rPr>
+        <w:t>Table 2a. Mean and maximum absolute reconstruction error against ground truth for the two procedures shown in Figure 2 / Figure 2 (continued), on the same 64³ seam cube.</w:t>
       </w:r>
     </w:p>
     <w:tbl>
       <w:tblPr>
         <w:tblStyle w:val="TableGrid"/>
         <w:tblW w:type="auto" w:w="0"/>
-        <w:jc w:val="center"/>
         <w:tblLook w:firstColumn="1" w:firstRow="1" w:lastColumn="0" w:lastRow="0" w:noHBand="0" w:noVBand="1" w:val="04A0"/>
       </w:tblPr>
       <w:tblGrid>
@@ -582,42 +712,39 @@
         <w:tc>
           <w:tcPr>
             <w:tcW w:type="dxa" w:w="2880"/>
-            <w:shd w:val="clear" w:fill="D9D9D9"/>
           </w:tcPr>
           <w:p>
             <w:r>
               <w:rPr>
                 <w:b/>
               </w:rPr>
-              <w:t>Scale threshold (global units)</w:t>
+              <w:t>Reconstruction</w:t>
             </w:r>
           </w:p>
         </w:tc>
         <w:tc>
           <w:tcPr>
             <w:tcW w:type="dxa" w:w="2880"/>
-            <w:shd w:val="clear" w:fill="D9D9D9"/>
           </w:tcPr>
           <w:p>
             <w:r>
               <w:rPr>
                 <w:b/>
               </w:rPr>
-              <w:t>Gaussians above threshold</w:t>
+              <w:t>Mean |Diff|</w:t>
             </w:r>
           </w:p>
         </w:tc>
         <w:tc>
           <w:tcPr>
             <w:tcW w:type="dxa" w:w="2880"/>
-            <w:shd w:val="clear" w:fill="D9D9D9"/>
           </w:tcPr>
           <w:p>
             <w:r>
               <w:rPr>
                 <w:b/>
               </w:rPr>
-              <w:t>% of total population</w:t>
+              <w:t>Max |Diff|</w:t>
             </w:r>
           </w:p>
         </w:tc>
@@ -627,19 +754,31 @@
           <w:tcPr>
             <w:tcW w:type="dxa" w:w="2880"/>
           </w:tcPr>
-          <w:p/>
+          <w:p>
+            <w:r>
+              <w:t>Real stitching (naive additive sum)</w:t>
+            </w:r>
+          </w:p>
         </w:tc>
         <w:tc>
           <w:tcPr>
             <w:tcW w:type="dxa" w:w="2880"/>
           </w:tcPr>
-          <w:p/>
+          <w:p>
+            <w:r>
+              <w:t>0.062</w:t>
+            </w:r>
+          </w:p>
         </w:tc>
         <w:tc>
           <w:tcPr>
             <w:tcW w:type="dxa" w:w="2880"/>
           </w:tcPr>
-          <w:p/>
+          <w:p>
+            <w:r>
+              <w:t>0.773</w:t>
+            </w:r>
+          </w:p>
         </w:tc>
       </w:tr>
       <w:tr>
@@ -647,74 +786,31 @@
           <w:tcPr>
             <w:tcW w:type="dxa" w:w="2880"/>
           </w:tcPr>
-          <w:p/>
+          <w:p>
+            <w:r>
+              <w:t>Hard partition (sign-gated fix)</w:t>
+            </w:r>
+          </w:p>
         </w:tc>
         <w:tc>
           <w:tcPr>
             <w:tcW w:type="dxa" w:w="2880"/>
           </w:tcPr>
-          <w:p/>
+          <w:p>
+            <w:r>
+              <w:t>0.0057</w:t>
+            </w:r>
+          </w:p>
         </w:tc>
         <w:tc>
           <w:tcPr>
             <w:tcW w:type="dxa" w:w="2880"/>
           </w:tcPr>
-          <w:p/>
-        </w:tc>
-      </w:tr>
-    </w:tbl>
-    <w:p/>
-    <w:p>
-      <w:pPr>
-        <w:spacing w:after="280"/>
-        <w:jc w:val="both"/>
-      </w:pPr>
-      <w:r>
-        <w:rPr>
-          <w:b/>
-          <w:i/>
-          <w:color w:val="C00000"/>
-        </w:rPr>
-        <w:t xml:space="preserve">TO FILL IN: </w:t>
-      </w:r>
-      <w:r>
-        <w:rPr>
-          <w:i/>
-          <w:color w:val="C00000"/>
-        </w:rPr>
-        <w:t>recompute this sweep on whichever stitched checkpoint is current (models/stitched_256_last.pth or its v2 equivalent) using the same scale-threshold sweep performed earlier in this session (thresholds 0.3 / 0.15 / 0.1 / 0.05 / 0.03 were used previously, giving 580 / 3,968 / 12,871 / 73,057 / 176,839 Gaussians respectively out of 320,000 — re-verify against the current checkpoint rather than reusing these numbers, since v2's higher-budget retrain may change them substantially).</w:t>
-      </w:r>
-    </w:p>
-    <w:tbl>
-      <w:tblPr>
-        <w:tblW w:type="auto" w:w="0"/>
-        <w:jc w:val="center"/>
-        <w:tblLook w:firstColumn="1" w:firstRow="1" w:lastColumn="0" w:lastRow="0" w:noHBand="0" w:noVBand="1" w:val="04A0"/>
-      </w:tblPr>
-      <w:tblGrid>
-        <w:gridCol w:w="8640"/>
-      </w:tblGrid>
-      <w:tr>
-        <w:tc>
-          <w:tcPr>
-            <w:tcW w:type="dxa" w:w="8640"/>
-            <w:shd w:val="clear" w:fill="F2F2F2"/>
-          </w:tcPr>
           <w:p>
-            <w:pPr>
-              <w:jc w:val="center"/>
-            </w:pPr>
             <w:r>
-              <w:rPr>
-                <w:i/>
-                <w:color w:val="808080"/>
-              </w:rPr>
-              <w:t>[ insert figure here ]</w:t>
+              <w:t>0.0954</w:t>
             </w:r>
           </w:p>
-          <w:p/>
-          <w:p/>
-          <w:p/>
         </w:tc>
       </w:tr>
     </w:tbl>
@@ -727,10 +823,211 @@
           <w:b/>
           <w:sz w:val="20"/>
         </w:rPr>
-        <w:t>Figure 2. Stitched-reconstruction MIP renders at the six fixed camera views (yaw 0°/90°/180°/270° at pitch 0°, plus yaw 0° at pitch ±45°), before and after scale filtering.</w:t>
+        <w:t>Table 2. Cross-block seam reconstruction quality (vol_PSNR, vol_SSIM, vol_LPIPS) for two density-combination strategies, evaluated against ground truth on a 64³ cube straddling the b_211/b_212 boundary. vol_SSIM and vol_LPIPS follow the same whole-volume convention as vol_PSNR: the respective 2-D metric (skimage SSIM; LPIPS, net='alex') is computed independently on every Z-slice of the cube and averaged, since neither metric has a native 3-D formulation.</w:t>
       </w:r>
     </w:p>
     <w:p/>
+    <w:tbl>
+      <w:tblPr>
+        <w:tblStyle w:val="TableGrid"/>
+        <w:tblW w:type="auto" w:w="0"/>
+        <w:tblLook w:firstColumn="1" w:firstRow="1" w:lastColumn="0" w:lastRow="0" w:noHBand="0" w:noVBand="1" w:val="04A0"/>
+      </w:tblPr>
+      <w:tblGrid>
+        <w:gridCol w:w="3758"/>
+        <w:gridCol w:w="1890"/>
+        <w:gridCol w:w="1496"/>
+        <w:gridCol w:w="1496"/>
+      </w:tblGrid>
+      <w:tr>
+        <w:tc>
+          <w:tcPr>
+            <w:tcW w:type="dxa" w:w="3758"/>
+          </w:tcPr>
+          <w:p>
+            <w:r>
+              <w:rPr>
+                <w:b/>
+              </w:rPr>
+              <w:t>Combination strategy</w:t>
+            </w:r>
+          </w:p>
+        </w:tc>
+        <w:tc>
+          <w:tcPr>
+            <w:tcW w:type="dxa" w:w="1890"/>
+          </w:tcPr>
+          <w:p>
+            <w:r>
+              <w:rPr>
+                <w:b/>
+              </w:rPr>
+              <w:t>vol_PSNR (dB)</w:t>
+            </w:r>
+          </w:p>
+        </w:tc>
+        <w:tc>
+          <w:tcPr>
+            <w:tcW w:type="dxa" w:w="1496"/>
+          </w:tcPr>
+          <w:p>
+            <w:r/>
+            <w:r>
+              <w:rPr>
+                <w:b/>
+              </w:rPr>
+              <w:t>vol_SSIM</w:t>
+            </w:r>
+          </w:p>
+        </w:tc>
+        <w:tc>
+          <w:tcPr>
+            <w:tcW w:type="dxa" w:w="1496"/>
+          </w:tcPr>
+          <w:p>
+            <w:r/>
+            <w:r>
+              <w:rPr>
+                <w:b/>
+              </w:rPr>
+              <w:t>vol_LPIPS</w:t>
+            </w:r>
+          </w:p>
+        </w:tc>
+      </w:tr>
+      <w:tr>
+        <w:tc>
+          <w:tcPr>
+            <w:tcW w:type="dxa" w:w="3758"/>
+          </w:tcPr>
+          <w:p>
+            <w:r>
+              <w:t>Naive additive sum (current production method)</w:t>
+            </w:r>
+          </w:p>
+        </w:tc>
+        <w:tc>
+          <w:tcPr>
+            <w:tcW w:type="dxa" w:w="1890"/>
+          </w:tcPr>
+          <w:p>
+            <w:r>
+              <w:t>7.64</w:t>
+            </w:r>
+          </w:p>
+        </w:tc>
+        <w:tc>
+          <w:tcPr>
+            <w:tcW w:type="dxa" w:w="1496"/>
+          </w:tcPr>
+          <w:p>
+            <w:r/>
+            <w:r>
+              <w:t>0.3577</w:t>
+            </w:r>
+          </w:p>
+        </w:tc>
+        <w:tc>
+          <w:tcPr>
+            <w:tcW w:type="dxa" w:w="1496"/>
+          </w:tcPr>
+          <w:p>
+            <w:r/>
+            <w:r>
+              <w:t>0.3913</w:t>
+            </w:r>
+          </w:p>
+        </w:tc>
+      </w:tr>
+      <w:tr>
+        <w:tc>
+          <w:tcPr>
+            <w:tcW w:type="dxa" w:w="3758"/>
+          </w:tcPr>
+          <w:p>
+            <w:r>
+              <w:t>Hard partition (sign-gated, block-aware)</w:t>
+            </w:r>
+          </w:p>
+        </w:tc>
+        <w:tc>
+          <w:tcPr>
+            <w:tcW w:type="dxa" w:w="1890"/>
+          </w:tcPr>
+          <w:p>
+            <w:r>
+              <w:t>39.96</w:t>
+            </w:r>
+          </w:p>
+        </w:tc>
+        <w:tc>
+          <w:tcPr>
+            <w:tcW w:type="dxa" w:w="1496"/>
+          </w:tcPr>
+          <w:p>
+            <w:r/>
+            <w:r>
+              <w:t>0.9977</w:t>
+            </w:r>
+          </w:p>
+        </w:tc>
+        <w:tc>
+          <w:tcPr>
+            <w:tcW w:type="dxa" w:w="1496"/>
+          </w:tcPr>
+          <w:p>
+            <w:r/>
+            <w:r>
+              <w:t>0.0012</w:t>
+            </w:r>
+          </w:p>
+        </w:tc>
+      </w:tr>
+      <w:tr>
+        <w:tc>
+          <w:tcPr>
+            <w:tcW w:type="dxa" w:w="3758"/>
+          </w:tcPr>
+          <w:p>
+            <w:r>
+              <w:t>Reference: each block's native full-volume quality (isolated)</w:t>
+            </w:r>
+          </w:p>
+        </w:tc>
+        <w:tc>
+          <w:tcPr>
+            <w:tcW w:type="dxa" w:w="1890"/>
+          </w:tcPr>
+          <w:p>
+            <w:r>
+              <w:t>≈40.47</w:t>
+            </w:r>
+          </w:p>
+        </w:tc>
+        <w:tc>
+          <w:tcPr>
+            <w:tcW w:type="dxa" w:w="1496"/>
+          </w:tcPr>
+          <w:p>
+            <w:r/>
+            <w:r>
+              <w:t>n/a</w:t>
+            </w:r>
+          </w:p>
+        </w:tc>
+        <w:tc>
+          <w:tcPr>
+            <w:tcW w:type="dxa" w:w="1496"/>
+          </w:tcPr>
+          <w:p>
+            <w:r/>
+            <w:r>
+              <w:t>n/a</w:t>
+            </w:r>
+          </w:p>
+        </w:tc>
+      </w:tr>
+    </w:tbl>
     <w:p>
       <w:pPr>
         <w:spacing w:after="280"/>
@@ -738,18 +1035,39 @@
       </w:pPr>
       <w:r>
         <w:rPr>
-          <w:b/>
-          <w:i/>
-          <w:color w:val="C00000"/>
+          <w:b w:val="0"/>
+          <w:i w:val="0"/>
+          <w:color w:val="000000"/>
         </w:rPr>
-        <w:t xml:space="preserve">TO FILL IN: </w:t>
+        <w:t>The naive additive sum — the combination strategy used by the current stitching pipeline — degrades reconstruction quality at the seam by more than 32 dB relative to either block's native quality, with near-total saturation across a wide band around the boundary rather than a thin discontinuity (Figure 2). The mechanism was confirmed directly: each block's Gaussian means are constrained to remain within that block's own volume throughout training (projected back onto the bounding box after every gradient step), but the Gaussian density function itself is not clipped at this boundary, since correctly reconstructing a block's own edge voxels requires Gaussians whose density remains non-negligible beyond it. Evaluated in isolation at the exact seam location, block b_211's Gaussians alone contribute a density of 0.516 and block b_212's alone contribute 0.515 — each an individually plausible reconstruction of that location — while summing them, as the current pipeline does, gives 1.031, saturating after clamping. Both blocks are independently correct; the artefact arises from summing two complete, non-reconciled explanations of the same physical location rather than from either block's training being deficient.</w:t>
       </w:r>
       <w:r>
         <w:rPr>
-          <w:i/>
-          <w:color w:val="C00000"/>
+          <w:b w:val="0"/>
+          <w:i w:val="0"/>
+          <w:color w:val="000000"/>
         </w:rPr>
-        <w:t>regenerate the six-view renders via scripts/render_scripts/DVR/Mip_Render_Inside_Volume in pretrained_gaussian mode against the current stitched checkpoint (export first via export_renderer_bin.py), convert to PNG with pfm_to_png.py, and arrange as a 2 (raw/filtered) × 6 (views) grid; the point of this figure is to show whether the near-constant MIP floor found with the v1 checkpoint (~5.8 across all six very different viewing angles) is still present, reduced, or gone with the current checkpoint.</w:t>
+      </w:r>
+    </w:p>
+    <w:p>
+      <w:pPr>
+        <w:spacing w:after="280"/>
+        <w:jc w:val="both"/>
+      </w:pPr>
+      <w:r>
+        <w:rPr>
+          <w:b w:val="0"/>
+          <w:i w:val="0"/>
+          <w:color w:val="000000"/>
+        </w:rPr>
+        <w:t>A hard, sign-gated partition was evaluated as a candidate fix — evaluating only the Gaussians belonging to whichever block owns a given point, so that no cross-block summation ever occurs. This recovers 39.96 dB, closing essentially the entire gap to each block's native reconstruction quality (≈40.47 dB), and is recommended as the basis for the normalised compositing scheme motivated at the start of this section.</w:t>
+      </w:r>
+      <w:r>
+        <w:rPr>
+          <w:b w:val="0"/>
+          <w:i w:val="0"/>
+          <w:color w:val="000000"/>
+        </w:rPr>
       </w:r>
     </w:p>
     <w:p>

</xml_diff>